<commit_message>
Fix three contradictions found reading the contract end to end
Support period: 3.5 started it at go-live while 3.6 started it at
acceptance. Since moving the final milestone, those are deliberately
different events - a client who accepts in week 8 and launches three
weeks later had two answers. Now starts on acceptance throughout.

Moving the team onto other work: clause 11 triggered at 7 days, clause
6.5 at 5+3 business days. Same remedy, two clocks. Clause 11 now reads
8 business days and points at 6.5 for the reminder process.

Work plan: page build ran Weeks 3-5, starting before development
commences in Week 4. Now Weeks 4-5. This was in the preset, so every
contract built from it carried the same contradiction.

Co-Authored-By: Claude Opus 5 <noreply@anthropic.com>
</commit_message>
<xml_diff>
--- a/template/atp-website.docx
+++ b/template/atp-website.docx
@@ -2583,7 +2583,7 @@
           <w:sz w:val="20"/>
           <w:szCs w:val="20"/>
         </w:rPr>
-        <w:t xml:space="preserve">{{support.included.sentence}} is included from go-live. During that </w:t>
+        <w:t xml:space="preserve">{{support.included.sentence}} is included, starting on acceptance under section 3.6. During that </w:t>
       </w:r>
       <w:proofErr w:type="gramStart"/>
       <w:r>
@@ -4391,7 +4391,7 @@
           <w:sz w:val="20"/>
           <w:szCs w:val="20"/>
         </w:rPr>
-        <w:t>If we are waiting on you for 7 days or more past a due date, we may move our team onto other work. Restarting can take up to as long as the delay, and we will confirm the new dates with you.</w:t>
+        <w:t>If we are waiting on you for 8 business days or more past a due date, we may move our team onto other work. Where we are waiting on an approval, section 6.5 sets out the reminders we send first. Restarting can take up to as long as the delay, and we will confirm the new dates with you.</w:t>
       </w:r>
       <w:proofErr w:type="gramStart"/>
       <w:r>

</xml_diff>

<commit_message>
Tighten the fee table and split the indemnity clause
Fee table: cell line spacing was 1.5 while tables 0 and 4 inherited and
the body runs 1.17 - the three data tables now share 1.15. Description
column widened to 4550 twips from the amount columns, which only ever
hold short figures, so every milestone description fits one line. The
data row carried a 600 twip minimum height from when they wrapped; now
330, matching the pages table.

Indemnity: split into cover and procedure. The clause is the densest in
the document and most likely to be read closely.

Co-Authored-By: Claude Opus 5 <noreply@anthropic.com>
</commit_message>
<xml_diff>
--- a/template/atp-website.docx
+++ b/template/atp-website.docx
@@ -934,7 +934,7 @@
           </w:tcPr>
           <w:p>
             <w:pPr>
-              <w:spacing w:line="360" w:lineRule="auto"/>
+              <w:spacing w:line="276" w:lineRule="auto"/>
               <w:rPr>
                 <w:rFonts w:ascii="Aptos" w:eastAsia="Aptos" w:hAnsi="Aptos" w:cs="Aptos"/>
                 <w:b/>
@@ -971,7 +971,7 @@
           </w:tcPr>
           <w:p>
             <w:pPr>
-              <w:spacing w:line="360" w:lineRule="auto"/>
+              <w:spacing w:line="276" w:lineRule="auto"/>
               <w:rPr>
                 <w:rFonts w:ascii="Aptos" w:eastAsia="Aptos" w:hAnsi="Aptos" w:cs="Aptos"/>
                 <w:b/>
@@ -1013,7 +1013,7 @@
           </w:tcPr>
           <w:p>
             <w:pPr>
-              <w:spacing w:line="360" w:lineRule="auto"/>
+              <w:spacing w:line="276" w:lineRule="auto"/>
               <w:rPr>
                 <w:rFonts w:ascii="Aptos" w:eastAsia="Aptos" w:hAnsi="Aptos" w:cs="Aptos"/>
                 <w:b/>
@@ -1048,7 +1048,7 @@
           </w:tcPr>
           <w:p>
             <w:pPr>
-              <w:spacing w:line="360" w:lineRule="auto"/>
+              <w:spacing w:line="276" w:lineRule="auto"/>
               <w:rPr>
                 <w:rFonts w:ascii="Aptos" w:eastAsia="Aptos" w:hAnsi="Aptos" w:cs="Aptos"/>
                 <w:color w:val="7F7F7F"/>
@@ -1450,9 +1450,9 @@
       </w:tblPr>
       <w:tblGrid>
         <w:gridCol w:w="1400"/>
-        <w:gridCol w:w="4152"/>
-        <w:gridCol w:w="1649"/>
-        <w:gridCol w:w="1649"/>
+        <w:gridCol w:w="4550"/>
+        <w:gridCol w:w="1450"/>
+        <w:gridCol w:w="1450"/>
       </w:tblGrid>
       <w:tr>
         <w:trPr>
@@ -1474,7 +1474,7 @@
           </w:tcPr>
           <w:p>
             <w:pPr>
-              <w:spacing w:line="360" w:lineRule="auto"/>
+              <w:spacing w:line="276" w:lineRule="auto"/>
               <w:rPr>
                 <w:sz w:val="18"/>
                 <w:szCs w:val="18"/>
@@ -1494,7 +1494,7 @@
         </w:tc>
         <w:tc>
           <w:tcPr>
-            <w:tcW w:w="4152" w:type="dxa"/>
+            <w:tcW w:w="4550" w:type="dxa"/>
             <w:shd w:val="clear" w:color="auto" w:fill="0C9476"/>
             <w:hideMark/>
             <w:tcBorders>
@@ -1506,7 +1506,7 @@
           </w:tcPr>
           <w:p>
             <w:pPr>
-              <w:spacing w:line="360" w:lineRule="auto"/>
+              <w:spacing w:line="276" w:lineRule="auto"/>
               <w:cnfStyle w:val="100000000000" w:firstRow="1" w:lastRow="0" w:firstColumn="0" w:lastColumn="0" w:oddVBand="0" w:evenVBand="0" w:oddHBand="0" w:evenHBand="0" w:firstRowFirstColumn="0" w:firstRowLastColumn="0" w:lastRowFirstColumn="0" w:lastRowLastColumn="0"/>
               <w:rPr>
                 <w:sz w:val="18"/>
@@ -1536,7 +1536,7 @@
         </w:tc>
         <w:tc>
           <w:tcPr>
-            <w:tcW w:w="1649" w:type="dxa"/>
+            <w:tcW w:w="1450" w:type="dxa"/>
             <w:shd w:val="clear" w:color="auto" w:fill="0C9476"/>
             <w:hideMark/>
             <w:tcBorders>
@@ -1548,7 +1548,7 @@
           </w:tcPr>
           <w:p>
             <w:pPr>
-              <w:spacing w:line="360" w:lineRule="auto"/>
+              <w:spacing w:line="276" w:lineRule="auto"/>
               <w:cnfStyle w:val="100000000000" w:firstRow="1" w:lastRow="0" w:firstColumn="0" w:lastColumn="0" w:oddVBand="0" w:evenVBand="0" w:oddHBand="0" w:evenHBand="0" w:firstRowFirstColumn="0" w:firstRowLastColumn="0" w:lastRowFirstColumn="0" w:lastRowLastColumn="0"/>
               <w:rPr>
                 <w:rFonts w:ascii="Aptos" w:hAnsi="Aptos" w:cs="Aptos"/>
@@ -1571,7 +1571,7 @@
           </w:p>
           <w:p>
             <w:pPr>
-              <w:spacing w:line="360" w:lineRule="auto"/>
+              <w:spacing w:line="276" w:lineRule="auto"/>
               <w:cnfStyle w:val="100000000000" w:firstRow="1" w:lastRow="0" w:firstColumn="0" w:lastColumn="0" w:oddVBand="0" w:evenVBand="0" w:oddHBand="0" w:evenHBand="0" w:firstRowFirstColumn="0" w:firstRowLastColumn="0" w:lastRowFirstColumn="0" w:lastRowLastColumn="0"/>
               <w:rPr>
                 <w:sz w:val="18"/>
@@ -1591,7 +1591,7 @@
         </w:tc>
         <w:tc>
           <w:tcPr>
-            <w:tcW w:w="1649" w:type="dxa"/>
+            <w:tcW w:w="1450" w:type="dxa"/>
             <w:shd w:val="clear" w:color="auto" w:fill="0C9476"/>
             <w:hideMark/>
             <w:tcBorders>
@@ -1603,7 +1603,7 @@
           </w:tcPr>
           <w:p>
             <w:pPr>
-              <w:spacing w:line="360" w:lineRule="auto"/>
+              <w:spacing w:line="276" w:lineRule="auto"/>
               <w:cnfStyle w:val="100000000000" w:firstRow="1" w:lastRow="0" w:firstColumn="0" w:lastColumn="0" w:oddVBand="0" w:evenVBand="0" w:oddHBand="0" w:evenHBand="0" w:firstRowFirstColumn="0" w:firstRowLastColumn="0" w:lastRowFirstColumn="0" w:lastRowLastColumn="0"/>
               <w:rPr>
                 <w:rFonts w:ascii="Aptos" w:hAnsi="Aptos" w:cs="Aptos"/>
@@ -1626,7 +1626,7 @@
           </w:p>
           <w:p>
             <w:pPr>
-              <w:spacing w:line="360" w:lineRule="auto"/>
+              <w:spacing w:line="276" w:lineRule="auto"/>
               <w:cnfStyle w:val="100000000000" w:firstRow="1" w:lastRow="0" w:firstColumn="0" w:lastColumn="0" w:oddVBand="0" w:evenVBand="0" w:oddHBand="0" w:evenHBand="0" w:firstRowFirstColumn="0" w:firstRowLastColumn="0" w:lastRowFirstColumn="0" w:lastRowLastColumn="0"/>
               <w:rPr>
                 <w:sz w:val="18"/>
@@ -1668,7 +1668,7 @@
       <w:tr>
         <w:trPr>
           <w:cnfStyle w:val="000000100000" w:firstRow="0" w:lastRow="0" w:firstColumn="0" w:lastColumn="0" w:oddVBand="0" w:evenVBand="0" w:oddHBand="1" w:evenHBand="0" w:firstRowFirstColumn="0" w:firstRowLastColumn="0" w:lastRowFirstColumn="0" w:lastRowLastColumn="0"/>
-          <w:trHeight w:val="600"/>
+          <w:trHeight w:val="330"/>
         </w:trPr>
         <w:tc>
           <w:tcPr>
@@ -1685,7 +1685,7 @@
           </w:tcPr>
           <w:p>
             <w:pPr>
-              <w:spacing w:line="360" w:lineRule="auto"/>
+              <w:spacing w:line="276" w:lineRule="auto"/>
               <w:jc w:val="both"/>
               <w:rPr>
                 <w:sz w:val="18"/>
@@ -1705,7 +1705,7 @@
         </w:tc>
         <w:tc>
           <w:tcPr>
-            <w:tcW w:w="4152" w:type="dxa"/>
+            <w:tcW w:w="4550" w:type="dxa"/>
             <w:shd w:val="clear" w:color="auto" w:fill="F2F2F2" w:themeFill="background1" w:themeFillShade="F2"/>
             <w:hideMark/>
             <w:tcBorders>
@@ -1717,7 +1717,7 @@
           </w:tcPr>
           <w:p>
             <w:pPr>
-              <w:spacing w:line="360" w:lineRule="auto"/>
+              <w:spacing w:line="276" w:lineRule="auto"/>
               <w:cnfStyle w:val="000000100000" w:firstRow="0" w:lastRow="0" w:firstColumn="0" w:lastColumn="0" w:oddVBand="0" w:evenVBand="0" w:oddHBand="1" w:evenHBand="0" w:firstRowFirstColumn="0" w:firstRowLastColumn="0" w:lastRowFirstColumn="0" w:lastRowLastColumn="0"/>
               <w:rPr>
                 <w:sz w:val="18"/>
@@ -1737,7 +1737,7 @@
         </w:tc>
         <w:tc>
           <w:tcPr>
-            <w:tcW w:w="1649" w:type="dxa"/>
+            <w:tcW w:w="1450" w:type="dxa"/>
             <w:shd w:val="clear" w:color="auto" w:fill="F2F2F2" w:themeFill="background1" w:themeFillShade="F2"/>
             <w:hideMark/>
             <w:tcBorders>
@@ -1749,7 +1749,7 @@
           </w:tcPr>
           <w:p>
             <w:pPr>
-              <w:spacing w:line="360" w:lineRule="auto"/>
+              <w:spacing w:line="276" w:lineRule="auto"/>
               <w:jc w:val="both"/>
               <w:cnfStyle w:val="000000100000" w:firstRow="0" w:lastRow="0" w:firstColumn="0" w:lastColumn="0" w:oddVBand="0" w:evenVBand="0" w:oddHBand="1" w:evenHBand="0" w:firstRowFirstColumn="0" w:firstRowLastColumn="0" w:lastRowFirstColumn="0" w:lastRowLastColumn="0"/>
               <w:rPr>
@@ -1782,7 +1782,7 @@
         </w:tc>
         <w:tc>
           <w:tcPr>
-            <w:tcW w:w="1649" w:type="dxa"/>
+            <w:tcW w:w="1450" w:type="dxa"/>
             <w:shd w:val="clear" w:color="auto" w:fill="F2F2F2" w:themeFill="background1" w:themeFillShade="F2"/>
             <w:hideMark/>
             <w:tcBorders>
@@ -1794,7 +1794,7 @@
           </w:tcPr>
           <w:p>
             <w:pPr>
-              <w:spacing w:line="360" w:lineRule="auto"/>
+              <w:spacing w:line="276" w:lineRule="auto"/>
               <w:jc w:val="both"/>
               <w:cnfStyle w:val="000000100000" w:firstRow="0" w:lastRow="0" w:firstColumn="0" w:lastColumn="0" w:oddVBand="0" w:evenVBand="0" w:oddHBand="1" w:evenHBand="0" w:firstRowFirstColumn="0" w:firstRowLastColumn="0" w:lastRowFirstColumn="0" w:lastRowLastColumn="0"/>
               <w:rPr>
@@ -1839,7 +1839,7 @@
       <w:tr>
         <w:trPr>
           <w:cnfStyle w:val="000000100000" w:firstRow="0" w:lastRow="0" w:firstColumn="0" w:lastColumn="0" w:oddVBand="0" w:evenVBand="0" w:oddHBand="1" w:evenHBand="0" w:firstRowFirstColumn="0" w:firstRowLastColumn="0" w:lastRowFirstColumn="0" w:lastRowLastColumn="0"/>
-          <w:trHeight w:val="440"/>
+          <w:trHeight w:val="360"/>
         </w:trPr>
         <w:tc>
           <w:tcPr>
@@ -1856,7 +1856,7 @@
           </w:tcPr>
           <w:p>
             <w:pPr>
-              <w:spacing w:line="360" w:lineRule="auto"/>
+              <w:spacing w:line="276" w:lineRule="auto"/>
               <w:jc w:val="both"/>
               <w:rPr>
                 <w:sz w:val="18"/>
@@ -1875,7 +1875,7 @@
         </w:tc>
         <w:tc>
           <w:tcPr>
-            <w:tcW w:w="4152" w:type="dxa"/>
+            <w:tcW w:w="4550" w:type="dxa"/>
             <w:shd w:val="clear" w:color="auto" w:fill="F2F2F2" w:themeFill="background1" w:themeFillShade="F2"/>
             <w:hideMark/>
             <w:tcBorders>
@@ -1887,7 +1887,7 @@
           </w:tcPr>
           <w:p>
             <w:pPr>
-              <w:spacing w:line="360" w:lineRule="auto"/>
+              <w:spacing w:line="276" w:lineRule="auto"/>
               <w:cnfStyle w:val="000000100000" w:firstRow="0" w:lastRow="0" w:firstColumn="0" w:lastColumn="0" w:oddVBand="0" w:evenVBand="0" w:oddHBand="1" w:evenHBand="0" w:firstRowFirstColumn="0" w:firstRowLastColumn="0" w:lastRowFirstColumn="0" w:lastRowLastColumn="0"/>
               <w:rPr>
                 <w:sz w:val="18"/>
@@ -1907,7 +1907,7 @@
         </w:tc>
         <w:tc>
           <w:tcPr>
-            <w:tcW w:w="1649" w:type="dxa"/>
+            <w:tcW w:w="1450" w:type="dxa"/>
             <w:shd w:val="clear" w:color="auto" w:fill="F2F2F2" w:themeFill="background1" w:themeFillShade="F2"/>
             <w:hideMark/>
             <w:tcBorders>
@@ -1919,7 +1919,7 @@
           </w:tcPr>
           <w:p>
             <w:pPr>
-              <w:spacing w:line="360" w:lineRule="auto"/>
+              <w:spacing w:line="276" w:lineRule="auto"/>
               <w:jc w:val="both"/>
               <w:cnfStyle w:val="000000100000" w:firstRow="0" w:lastRow="0" w:firstColumn="0" w:lastColumn="0" w:oddVBand="0" w:evenVBand="0" w:oddHBand="1" w:evenHBand="0" w:firstRowFirstColumn="0" w:firstRowLastColumn="0" w:lastRowFirstColumn="0" w:lastRowLastColumn="0"/>
               <w:rPr>
@@ -1950,7 +1950,7 @@
         </w:tc>
         <w:tc>
           <w:tcPr>
-            <w:tcW w:w="1649" w:type="dxa"/>
+            <w:tcW w:w="1450" w:type="dxa"/>
             <w:shd w:val="clear" w:color="auto" w:fill="F2F2F2" w:themeFill="background1" w:themeFillShade="F2"/>
             <w:hideMark/>
             <w:tcBorders>
@@ -1962,7 +1962,7 @@
           </w:tcPr>
           <w:p>
             <w:pPr>
-              <w:spacing w:line="360" w:lineRule="auto"/>
+              <w:spacing w:line="276" w:lineRule="auto"/>
               <w:jc w:val="both"/>
               <w:cnfStyle w:val="000000100000" w:firstRow="0" w:lastRow="0" w:firstColumn="0" w:lastColumn="0" w:oddVBand="0" w:evenVBand="0" w:oddHBand="1" w:evenHBand="0" w:firstRowFirstColumn="0" w:firstRowLastColumn="0" w:lastRowFirstColumn="0" w:lastRowLastColumn="0"/>
               <w:rPr>
@@ -2181,6 +2181,7 @@
           </w:tcPr>
           <w:p>
             <w:pPr>
+              <w:spacing w:line="276" w:lineRule="auto"/>
               <w:rPr>
                 <w:rFonts w:ascii="Aptos" w:eastAsia="Aptos" w:hAnsi="Aptos" w:cs="Aptos"/>
                 <w:color w:val="FFFFFF"/>
@@ -2213,6 +2214,7 @@
           </w:tcPr>
           <w:p>
             <w:pPr>
+              <w:spacing w:line="276" w:lineRule="auto"/>
               <w:rPr>
                 <w:rFonts w:ascii="Aptos" w:eastAsia="Aptos" w:hAnsi="Aptos" w:cs="Aptos"/>
                 <w:color w:val="FFFFFF"/>
@@ -2245,6 +2247,7 @@
           </w:tcPr>
           <w:p>
             <w:pPr>
+              <w:spacing w:line="276" w:lineRule="auto"/>
               <w:rPr>
                 <w:rFonts w:ascii="Aptos" w:eastAsia="Aptos" w:hAnsi="Aptos" w:cs="Aptos"/>
                 <w:color w:val="FFFFFF"/>
@@ -2282,7 +2285,7 @@
           </w:tcPr>
           <w:p>
             <w:pPr>
-              <w:spacing w:line="360" w:lineRule="auto"/>
+              <w:spacing w:line="276" w:lineRule="auto"/>
               <w:rPr>
                 <w:rFonts w:ascii="Aptos" w:eastAsia="Aptos" w:hAnsi="Aptos" w:cs="Aptos"/>
                 <w:b/>
@@ -2317,7 +2320,7 @@
           </w:tcPr>
           <w:p>
             <w:pPr>
-              <w:spacing w:line="360" w:lineRule="auto"/>
+              <w:spacing w:line="276" w:lineRule="auto"/>
               <w:rPr>
                 <w:rFonts w:ascii="Aptos" w:eastAsia="Aptos" w:hAnsi="Aptos" w:cs="Aptos"/>
                 <w:color w:val="7F7F7F"/>
@@ -2350,7 +2353,7 @@
           </w:tcPr>
           <w:p>
             <w:pPr>
-              <w:spacing w:line="360" w:lineRule="auto"/>
+              <w:spacing w:line="276" w:lineRule="auto"/>
               <w:rPr>
                 <w:rFonts w:ascii="Aptos" w:eastAsia="Aptos" w:hAnsi="Aptos" w:cs="Aptos"/>
                 <w:color w:val="7F7F7F"/>
@@ -4294,7 +4297,36 @@
           <w:sz w:val="20"/>
           <w:szCs w:val="20"/>
         </w:rPr>
-        <w:t>You will cover us for any claim brought against us arising from content, materials or instructions you supplied – for example, a claim that they infringe someone else’s rights, or that privacy, disclosure or regulatory wording you supplied is wrong – except to the extent the claim is caused by our own negligence or breach. This cover is subject to the same limit as our liability above, except for claims that the content, materials or instructions you supplied infringe someone else’s intellectual property rights or breach privacy law, which are not subject to that limit. If a claim of that kind is made, we will tell you promptly, will not admit or settle it without your agreement, and will let you run the defence if you ask, at your cost. We will give you reasonable help, and we will take reasonable steps to keep the loss down.</w:t>
+        <w:t xml:space="preserve">You will cover us for any claim brought against us arising from content, materials or instructions you supplied – for example, a claim that they infringe someone else’s rights, or that privacy, disclosure or regulatory wording you supplied is wrong – except to the extent the claim is caused by our own negligence or breach. This cover is subject to the same limit as our liability above, except for claims that the content, materials or instructions you supplied infringe someone else’s intellectual property rights or breach privacy law, which are not subject to that limit. </w:t>
+      </w:r>
+    </w:p>
+    <w:p>
+      <w:pPr>
+        <w:jc w:val="both"/>
+        <w:rPr>
+          <w:rFonts w:ascii="Aptos" w:eastAsia="Aptos" w:hAnsi="Aptos" w:cs="Aptos"/>
+          <w:sz w:val="20"/>
+          <w:szCs w:val="20"/>
+        </w:rPr>
+      </w:pPr>
+    </w:p>
+    <w:p>
+      <w:pPr>
+        <w:spacing w:line="280" w:lineRule="auto"/>
+        <w:jc w:val="both"/>
+        <w:rPr>
+          <w:rFonts w:ascii="Aptos" w:eastAsia="Aptos" w:hAnsi="Aptos" w:cs="Aptos"/>
+          <w:sz w:val="20"/>
+          <w:szCs w:val="20"/>
+        </w:rPr>
+      </w:pPr>
+      <w:r>
+        <w:rPr>
+          <w:rFonts w:ascii="Aptos" w:eastAsia="Aptos" w:hAnsi="Aptos" w:cs="Aptos"/>
+          <w:sz w:val="20"/>
+          <w:szCs w:val="20"/>
+        </w:rPr>
+        <w:t>If a claim of that kind is made, we will tell you promptly, will not admit or settle it without your agreement, and will let you run the defence if you ask, at your cost. We will give you reasonable help, and we will take reasonable steps to keep the loss down.</w:t>
       </w:r>
     </w:p>
     <w:p>

</xml_diff>

<commit_message>
Tokenise the two general clauses that hardcoded 'website'
6.6 and the background IP licence in 9.0 are general clauses, so on an
app build they read 'work as a website' and 'as part of your website'.
Both now use {{deliverable}}.

Left alone deliberately: 9.0 also says 'in our portfolio, website,
proposals and marketing', which is Encyte's own website. A blanket
replace would have broken it silently.

Tokenising after an indefinite article produced 'a app', so the article
is now derived alongside the deliverable and 6.6 uses it. Checked across
all four deliverable types: a website, an app, a brand identity.

Co-Authored-By: Claude Opus 5 <noreply@anthropic.com>
</commit_message>
<xml_diff>
--- a/template/atp-website.docx
+++ b/template/atp-website.docx
@@ -3707,7 +3707,7 @@
           <w:sz w:val="20"/>
           <w:szCs w:val="20"/>
         </w:rPr>
-        <w:t xml:space="preserve"> If you give us a design, layout or other material to work from, you confirm you have the right to use it, and section 6.1 applies to it. It may need changes to work as a website – to hold together across screen sizes, to meet contrast and accessibility needs, and to stay consistent as pages are added. Making those changes is part of the build, and we will point out anything significant we changed. Material generated with an AI tool may not be protected by copyright at all, which can mean neither of us is able to stop someone else copying it.</w:t>
+        <w:t xml:space="preserve"> If you give us a design, layout or other material to work from, you confirm you have the right to use it, and section 6.1 applies to it. It may need changes to work as {{deliverable.article}} {{deliverable}} – to hold together across screen sizes, to meet contrast and accessibility needs, and to stay consistent as pages are added. Making those changes is part of the build, and we will point out anything significant we changed. Material generated with an AI tool may not be protected by copyright at all, which can mean neither of us is able to stop someone else copying it.</w:t>
       </w:r>
     </w:p>
     <w:p>
@@ -4178,7 +4178,7 @@
           <w:sz w:val="20"/>
           <w:szCs w:val="20"/>
         </w:rPr>
-        <w:t>licence</w:t>
+        <w:t>licence to use them as part of your {{deliverable}}</w:t>
       </w:r>
       <w:proofErr w:type="spellEnd"/>
       <w:r>
@@ -4187,7 +4187,7 @@
           <w:sz w:val="20"/>
           <w:szCs w:val="20"/>
         </w:rPr>
-        <w:t xml:space="preserve"> to use them as part of your website. Third-party materials such as {{scope.platform}}, open-source code, stock images, fonts and plugins stay with their owners and are supplied on their own </w:t>
+        <w:t xml:space="preserve">. Third-party materials such as {{scope.platform}}, open-source code, stock images, fonts and plugins stay with their owners and are supplied on their own </w:t>
       </w:r>
       <w:proofErr w:type="spellStart"/>
       <w:r>

</xml_diff>

<commit_message>
Key handover to acceptance, like the payment and the support period
3.7 gave administrator access at launch while the final milestone is
invoiced on acceptance and the support period starts there too. A client
who accepted in week 8 and launched six weeks later had their support
running, and had paid the final 40%, with no access to the site it
covered.

Acceptance and launch became different events when the milestone moved;
this is the last clause that had not followed. All three now agree, and
the phrase 'at launch' no longer appears.

Co-Authored-By: Claude Opus 5 <noreply@anthropic.com>
</commit_message>
<xml_diff>
--- a/template/atp-website.docx
+++ b/template/atp-website.docx
@@ -3030,7 +3030,7 @@
           <w:sz w:val="20"/>
           <w:szCs w:val="20"/>
         </w:rPr>
-        <w:t>At launch you receive full {{scope.platform}} administrator access, a short handover session, and guidance for publishing and updating content</w:t>
+        <w:t>On acceptance you receive full {{scope.platform}} administrator access, a short handover session, and guidance for publishing and updating content</w:t>
       </w:r>
       <w:r>
         <w:rPr>
@@ -3261,7 +3261,7 @@
           <w:sz w:val="20"/>
           <w:szCs w:val="20"/>
         </w:rPr>
-        <w:t xml:space="preserve"> We hand over final files, account transfers and ownership once all invoices are paid in full. Administrator access is given at launch under section 3.7.</w:t>
+        <w:t xml:space="preserve"> We hand over final files, account transfers and ownership once all invoices are paid in full. Administrator access is given on acceptance under section 3.7.</w:t>
       </w:r>
     </w:p>
     <w:p>

</xml_diff>

<commit_message>
Drop the domain from 5.0 and the deliverable noun from 6.1
5.0 named the client's domain when the sentence works without it -
'including the domain and the hosting' says the same thing.

6.1 twice named what was being built. It reads better without: 'you
provide the copy, images, logos and data' and 'making sure your content
is accurate'. That also makes the clause project-type agnostic without
needing a token to do it.

{{client.domain}} is still used in the 2.3 bullet, so the field is not
retired yet.

Co-Authored-By: Claude Opus 5 <noreply@anthropic.com>
</commit_message>
<xml_diff>
--- a/template/atp-website.docx
+++ b/template/atp-website.docx
@@ -3347,7 +3347,7 @@
           <w:sz w:val="20"/>
           <w:szCs w:val="20"/>
         </w:rPr>
-        <w:t>, domains, hosting or photography. We will get your written approval before buying anything, then pass the cost on at what we paid. Where you hold the account with a third-party service – including the {{client.domain}} domain and the hosting</w:t>
+        <w:t>, domains, hosting or photography. We will get your written approval before buying anything, then pass the cost on at what we paid. Where you hold the account with a third-party service – including the domain and the hosting</w:t>
       </w:r>
       <w:proofErr w:type="spellStart"/>
       <w:r>
@@ -3472,7 +3472,7 @@
           <w:sz w:val="20"/>
           <w:szCs w:val="20"/>
         </w:rPr>
-        <w:t xml:space="preserve"> You provide the copy, images, logos and data for the {{deliverable}} and confirm you have the right to use them. You are responsible for clearing any copyright, </w:t>
+        <w:t xml:space="preserve"> You provide the copy, images, logos and data, and confirm you have the right to use them. You are responsible for clearing any copyright, </w:t>
       </w:r>
       <w:proofErr w:type="gramStart"/>
       <w:r>
@@ -3490,7 +3490,7 @@
           <w:sz w:val="20"/>
           <w:szCs w:val="20"/>
         </w:rPr>
-        <w:t xml:space="preserve"> or other permissions, and for making sure what appears on the {{deliverable}} is accurate and complies with Australian law, including the {{consumer_law}} and the {{privacy_act}}</w:t>
+        <w:t xml:space="preserve"> or other permissions, and for making sure your content is accurate and complies with Australian law, including the {{consumer_law}} and the {{privacy_act}}</w:t>
       </w:r>
       <w:proofErr w:type="spellStart"/>
       <w:r>

</xml_diff>